<commit_message>
Báo cáo tuần 21-26/09: thêm việc tìm nhà sản xuất bọt biển tắm bé
Co-Authored-By: Claude Opus 5.5 <noreply@anthropic.com>
Claude-Session: https://claude.ai/code/session_01SmacjJ2ktiN2dre26trFbb
</commit_message>
<xml_diff>
--- a/Báo cáo tuần/Mẫu DKX (cá nhân) - Báo cáo kết quả công việc tuần 21-26.09.2026.docx
+++ b/Báo cáo tuần/Mẫu DKX (cá nhân) - Báo cáo kết quả công việc tuần 21-26.09.2026.docx
@@ -900,6 +900,133 @@
           </w:p>
         </w:tc>
       </w:tr>
+      <w:tr>
+        <w:tc>
+          <w:tcPr>
+            <w:tcW w:w="2348" w:type="dxa"/>
+          </w:tcPr>
+          <w:p>
+            <w:pPr>
+              <w:spacing w:line="360" w:lineRule="auto"/>
+              <w:rPr>
+                <w:rFonts w:ascii="Times New Roman" w:hAnsi="Times New Roman" w:cs="Times New Roman"/>
+                <w:b/>
+                <w:bCs/>
+                <w:sz w:val="26"/>
+                <w:szCs w:val="26"/>
+                <w:lang w:val="vi-VN"/>
+              </w:rPr>
+            </w:pPr>
+            <w:r>
+              <w:rPr>
+                <w:rFonts w:ascii="Times New Roman" w:hAnsi="Times New Roman" w:cs="Times New Roman"/>
+                <w:sz w:val="26"/>
+                <w:szCs w:val="26"/>
+              </w:rPr>
+              <w:t>Việc phát sinh – Bọt biển tắm bé: tìm nhà sản xuất</w:t>
+            </w:r>
+          </w:p>
+        </w:tc>
+        <w:tc>
+          <w:tcPr>
+            <w:tcW w:w="2042" w:type="dxa"/>
+          </w:tcPr>
+          <w:p>
+            <w:pPr>
+              <w:spacing w:line="360" w:lineRule="auto"/>
+              <w:rPr>
+                <w:rFonts w:ascii="Times New Roman" w:hAnsi="Times New Roman" w:cs="Times New Roman"/>
+                <w:b/>
+                <w:bCs/>
+                <w:sz w:val="26"/>
+                <w:szCs w:val="26"/>
+                <w:lang w:val="vi-VN"/>
+              </w:rPr>
+            </w:pPr>
+            <w:r>
+              <w:rPr>
+                <w:rFonts w:ascii="Times New Roman" w:hAnsi="Times New Roman" w:cs="Times New Roman"/>
+                <w:sz w:val="26"/>
+                <w:szCs w:val="26"/>
+              </w:rPr>
+              <w:t>[Điền yêu cầu được giao]</w:t>
+            </w:r>
+          </w:p>
+        </w:tc>
+        <w:tc>
+          <w:tcPr>
+            <w:tcW w:w="1984" w:type="dxa"/>
+          </w:tcPr>
+          <w:p>
+            <w:pPr>
+              <w:spacing w:line="360" w:lineRule="auto"/>
+              <w:rPr>
+                <w:rFonts w:ascii="Times New Roman" w:hAnsi="Times New Roman" w:cs="Times New Roman"/>
+                <w:b/>
+                <w:bCs/>
+                <w:sz w:val="26"/>
+                <w:szCs w:val="26"/>
+                <w:lang w:val="vi-VN"/>
+              </w:rPr>
+            </w:pPr>
+            <w:r>
+              <w:rPr>
+                <w:rFonts w:ascii="Times New Roman" w:hAnsi="Times New Roman" w:cs="Times New Roman"/>
+                <w:sz w:val="26"/>
+                <w:szCs w:val="26"/>
+              </w:rPr>
+              <w:t>Mượn được 02 miếng bọt biển tắm bé.</w:t>
+            </w:r>
+          </w:p>
+          <w:p>
+            <w:pPr>
+              <w:spacing w:line="360" w:lineRule="auto"/>
+              <w:rPr>
+                <w:rFonts w:ascii="Times New Roman" w:hAnsi="Times New Roman" w:cs="Times New Roman"/>
+                <w:b/>
+                <w:bCs/>
+                <w:sz w:val="26"/>
+                <w:szCs w:val="26"/>
+                <w:lang w:val="vi-VN"/>
+              </w:rPr>
+            </w:pPr>
+            <w:r>
+              <w:rPr>
+                <w:rFonts w:ascii="Times New Roman" w:hAnsi="Times New Roman" w:cs="Times New Roman"/>
+                <w:sz w:val="26"/>
+                <w:szCs w:val="26"/>
+              </w:rPr>
+              <w:t>Tìm được nhà máy sản xuất và số điện thoại liên hệ.</w:t>
+            </w:r>
+          </w:p>
+        </w:tc>
+        <w:tc>
+          <w:tcPr>
+            <w:tcW w:w="1985" w:type="dxa"/>
+          </w:tcPr>
+          <w:p>
+            <w:pPr>
+              <w:spacing w:line="360" w:lineRule="auto"/>
+              <w:rPr>
+                <w:rFonts w:ascii="Times New Roman" w:hAnsi="Times New Roman" w:cs="Times New Roman"/>
+                <w:b/>
+                <w:bCs/>
+                <w:sz w:val="26"/>
+                <w:szCs w:val="26"/>
+                <w:lang w:val="vi-VN"/>
+              </w:rPr>
+            </w:pPr>
+            <w:r>
+              <w:rPr>
+                <w:rFonts w:ascii="Times New Roman" w:hAnsi="Times New Roman" w:cs="Times New Roman"/>
+                <w:sz w:val="26"/>
+                <w:szCs w:val="26"/>
+              </w:rPr>
+              <w:t>Chưa đạt: đã gọi nhưng chưa đúng người phụ trách; chưa tìm được kênh liên hệ khác.</w:t>
+            </w:r>
+          </w:p>
+        </w:tc>
+      </w:tr>
     </w:tbl>
     <w:p>
       <w:pPr>
@@ -933,7 +1060,7 @@
           <w:szCs w:val="26"/>
           <w:lang w:val="vi-VN"/>
         </w:rPr>
-        <w:t>Tổng quan: trong tuần, trọng tâm tiếp tục là Nhóm 7 (hỗ trợ điểm bán): hoàn thành bộ sell-out kit xếp theo vấn đề da bé, bảng khối vấn đề từ chối mua hàng (bản đầy đủ và bản 1 trang A4), và 02 mẫu poster cho nhân viên bán hàng đang chờ duyệt. Phần nghiệp vụ hàng ngày và các hạng mục chuyển tiếp từ kế hoạch tuần trước cần bổ sung số liệu thực tế tại các ô [Điền].</w:t>
+        <w:t>Tổng quan: trong tuần, trọng tâm tiếp tục là Nhóm 7 (hỗ trợ điểm bán): hoàn thành bộ sell-out kit xếp theo vấn đề da bé, bảng khối vấn đề từ chối mua hàng (bản đầy đủ và bản 1 trang A4), và 02 mẫu poster cho nhân viên bán hàng đang chờ duyệt. Việc phát sinh: tìm nhà sản xuất bọt biển tắm bé – đã có tên nhà máy và số điện thoại nhưng chưa liên hệ được đúng người phụ trách. Phần nghiệp vụ hàng ngày và các hạng mục chuyển tiếp từ kế hoạch tuần trước cần bổ sung số liệu thực tế tại các ô [Điền].</w:t>
       </w:r>
     </w:p>
     <w:p>
@@ -3819,6 +3946,115 @@
                 <w:szCs w:val="26"/>
               </w:rPr>
               <w:t>[Điền]</w:t>
+            </w:r>
+          </w:p>
+        </w:tc>
+      </w:tr>
+      <w:tr>
+        <w:trPr>
+          <w:trHeight w:val="449"/>
+        </w:trPr>
+        <w:tc>
+          <w:tcPr>
+            <w:tcW w:w="2677" w:type="dxa"/>
+          </w:tcPr>
+          <w:p>
+            <w:pPr>
+              <w:spacing w:line="360" w:lineRule="auto"/>
+              <w:rPr>
+                <w:rFonts w:ascii="Times New Roman" w:hAnsi="Times New Roman" w:cs="Times New Roman"/>
+                <w:b/>
+                <w:bCs/>
+                <w:sz w:val="26"/>
+                <w:szCs w:val="26"/>
+                <w:lang w:val="vi-VN"/>
+              </w:rPr>
+            </w:pPr>
+            <w:r>
+              <w:rPr>
+                <w:rFonts w:ascii="Times New Roman" w:hAnsi="Times New Roman" w:cs="Times New Roman"/>
+                <w:sz w:val="26"/>
+                <w:szCs w:val="26"/>
+              </w:rPr>
+              <w:t>MT6 – Liên hệ được đúng người phụ trách tại nhà máy sản xuất bọt biển tắm bé</w:t>
+            </w:r>
+          </w:p>
+        </w:tc>
+        <w:tc>
+          <w:tcPr>
+            <w:tcW w:w="2328" w:type="dxa"/>
+          </w:tcPr>
+          <w:p>
+            <w:pPr>
+              <w:spacing w:line="360" w:lineRule="auto"/>
+              <w:rPr>
+                <w:rFonts w:ascii="Times New Roman" w:hAnsi="Times New Roman" w:cs="Times New Roman"/>
+                <w:b/>
+                <w:bCs/>
+                <w:sz w:val="26"/>
+                <w:szCs w:val="26"/>
+                <w:lang w:val="vi-VN"/>
+              </w:rPr>
+            </w:pPr>
+            <w:r>
+              <w:rPr>
+                <w:rFonts w:ascii="Times New Roman" w:hAnsi="Times New Roman" w:cs="Times New Roman"/>
+                <w:sz w:val="26"/>
+                <w:szCs w:val="26"/>
+              </w:rPr>
+              <w:t>Có được đầu mối đúng bộ phận phụ trách.</w:t>
+            </w:r>
+          </w:p>
+        </w:tc>
+        <w:tc>
+          <w:tcPr>
+            <w:tcW w:w="2262" w:type="dxa"/>
+          </w:tcPr>
+          <w:p>
+            <w:pPr>
+              <w:spacing w:line="360" w:lineRule="auto"/>
+              <w:rPr>
+                <w:rFonts w:ascii="Times New Roman" w:hAnsi="Times New Roman" w:cs="Times New Roman"/>
+                <w:b/>
+                <w:bCs/>
+                <w:sz w:val="26"/>
+                <w:szCs w:val="26"/>
+                <w:lang w:val="vi-VN"/>
+              </w:rPr>
+            </w:pPr>
+            <w:r>
+              <w:rPr>
+                <w:rFonts w:ascii="Times New Roman" w:hAnsi="Times New Roman" w:cs="Times New Roman"/>
+                <w:sz w:val="26"/>
+                <w:szCs w:val="26"/>
+              </w:rPr>
+              <w:t>Gọi lại số đã có, nhờ chuyển tới đúng bộ phận phụ trách; tìm thêm kênh liên hệ khác của nhà máy (email, website, fanpage).</w:t>
+            </w:r>
+          </w:p>
+        </w:tc>
+        <w:tc>
+          <w:tcPr>
+            <w:tcW w:w="2263" w:type="dxa"/>
+          </w:tcPr>
+          <w:p>
+            <w:pPr>
+              <w:spacing w:line="360" w:lineRule="auto"/>
+              <w:rPr>
+                <w:rFonts w:ascii="Times New Roman" w:hAnsi="Times New Roman" w:cs="Times New Roman"/>
+                <w:b/>
+                <w:bCs/>
+                <w:sz w:val="26"/>
+                <w:szCs w:val="26"/>
+                <w:lang w:val="vi-VN"/>
+              </w:rPr>
+            </w:pPr>
+            <w:r>
+              <w:rPr>
+                <w:rFonts w:ascii="Times New Roman" w:hAnsi="Times New Roman" w:cs="Times New Roman"/>
+                <w:sz w:val="26"/>
+                <w:szCs w:val="26"/>
+              </w:rPr>
+              <w:t>[Điền thời hạn]</w:t>
             </w:r>
           </w:p>
         </w:tc>

</xml_diff>

<commit_message>
Báo cáo tuần 21-26/09: điền chỉ tiêu cột Kế hoạch, cập nhật MT3 theo bản Nhi sửa
Co-Authored-By: Claude Opus 5.5 <noreply@anthropic.com>
Claude-Session: https://claude.ai/code/session_01SmacjJ2ktiN2dre26trFbb
</commit_message>
<xml_diff>
--- a/Báo cáo tuần/Mẫu DKX (cá nhân) - Báo cáo kết quả công việc tuần 21-26.09.2026.docx
+++ b/Báo cáo tuần/Mẫu DKX (cá nhân) - Báo cáo kết quả công việc tuần 21-26.09.2026.docx
@@ -441,7 +441,28 @@
                 <w:sz w:val="26"/>
                 <w:szCs w:val="26"/>
               </w:rPr>
-              <w:t>[Điền chỉ tiêu được giao]</w:t>
+              <w:t>Hoàn thiện bộ công cụ bán hàng cho shop xếp theo vấn đề da bé, áp dụng cho 07 sản phẩm dành cho bé: 01 bộ kit + 01 bảng tra nhanh dán quầy.</w:t>
+            </w:r>
+          </w:p>
+          <w:p>
+            <w:pPr>
+              <w:spacing w:line="360" w:lineRule="auto"/>
+              <w:rPr>
+                <w:rFonts w:ascii="Times New Roman" w:hAnsi="Times New Roman" w:cs="Times New Roman"/>
+                <w:b/>
+                <w:bCs/>
+                <w:sz w:val="26"/>
+                <w:szCs w:val="26"/>
+                <w:lang w:val="vi-VN"/>
+              </w:rPr>
+            </w:pPr>
+            <w:r>
+              <w:rPr>
+                <w:rFonts w:ascii="Times New Roman" w:hAnsi="Times New Roman" w:cs="Times New Roman"/>
+                <w:sz w:val="26"/>
+                <w:szCs w:val="26"/>
+              </w:rPr>
+              <w:t>Dựng mẫu poster cho NVBH trình duyệt.</w:t>
             </w:r>
           </w:p>
         </w:tc>
@@ -568,7 +589,28 @@
                 <w:sz w:val="26"/>
                 <w:szCs w:val="26"/>
               </w:rPr>
-              <w:t>[Điền chỉ tiêu được giao]</w:t>
+              <w:t>01 khung xử lý từ chối mua hàng dùng chung cho toàn bộ 13 sản phẩm/dòng OTC, có bản 1 trang A4 để dán quầy.</w:t>
+            </w:r>
+          </w:p>
+          <w:p>
+            <w:pPr>
+              <w:spacing w:line="360" w:lineRule="auto"/>
+              <w:rPr>
+                <w:rFonts w:ascii="Times New Roman" w:hAnsi="Times New Roman" w:cs="Times New Roman"/>
+                <w:b/>
+                <w:bCs/>
+                <w:sz w:val="26"/>
+                <w:szCs w:val="26"/>
+                <w:lang w:val="vi-VN"/>
+              </w:rPr>
+            </w:pPr>
+            <w:r>
+              <w:rPr>
+                <w:rFonts w:ascii="Times New Roman" w:hAnsi="Times New Roman" w:cs="Times New Roman"/>
+                <w:sz w:val="26"/>
+                <w:szCs w:val="26"/>
+              </w:rPr>
+              <w:t>100% tài liệu phát ra điểm bán tuân thủ quy tắc ngôn từ mỹ phẩm/TPBVSK.</w:t>
             </w:r>
           </w:p>
         </w:tc>
@@ -695,7 +737,28 @@
                 <w:sz w:val="26"/>
                 <w:szCs w:val="26"/>
               </w:rPr>
-              <w:t>[Điền chỉ tiêu được giao]</w:t>
+              <w:t>Nắm vai trò của từng sản phẩm trong từng vấn đề da bé để tự tư vấn và đào tạo lại cho NV shop.</w:t>
+            </w:r>
+          </w:p>
+          <w:p>
+            <w:pPr>
+              <w:spacing w:line="360" w:lineRule="auto"/>
+              <w:rPr>
+                <w:rFonts w:ascii="Times New Roman" w:hAnsi="Times New Roman" w:cs="Times New Roman"/>
+                <w:b/>
+                <w:bCs/>
+                <w:sz w:val="26"/>
+                <w:szCs w:val="26"/>
+                <w:lang w:val="vi-VN"/>
+              </w:rPr>
+            </w:pPr>
+            <w:r>
+              <w:rPr>
+                <w:rFonts w:ascii="Times New Roman" w:hAnsi="Times New Roman" w:cs="Times New Roman"/>
+                <w:sz w:val="26"/>
+                <w:szCs w:val="26"/>
+              </w:rPr>
+              <w:t>Sắp xếp kho tài liệu theo 7 nhóm việc bàn giao để tra cứu nhanh.</w:t>
             </w:r>
           </w:p>
         </w:tc>
@@ -745,27 +808,6 @@
               <w:t>Sắp xếp lại kho tài liệu theo 7 nhóm việc trong bản bàn giao.</w:t>
             </w:r>
           </w:p>
-          <w:p>
-            <w:pPr>
-              <w:spacing w:line="360" w:lineRule="auto"/>
-              <w:rPr>
-                <w:rFonts w:ascii="Times New Roman" w:hAnsi="Times New Roman" w:cs="Times New Roman"/>
-                <w:b/>
-                <w:bCs/>
-                <w:sz w:val="26"/>
-                <w:szCs w:val="26"/>
-                <w:lang w:val="vi-VN"/>
-              </w:rPr>
-            </w:pPr>
-            <w:r>
-              <w:rPr>
-                <w:rFonts w:ascii="Times New Roman" w:hAnsi="Times New Roman" w:cs="Times New Roman"/>
-                <w:sz w:val="26"/>
-                <w:szCs w:val="26"/>
-              </w:rPr>
-              <w:t>AMIS: [Điền tiến độ]</w:t>
-            </w:r>
-          </w:p>
         </w:tc>
         <w:tc>
           <w:tcPr>
@@ -789,7 +831,7 @@
                 <w:sz w:val="26"/>
                 <w:szCs w:val="26"/>
               </w:rPr>
-              <w:t>Đạt phần kiến thức sản phẩm. AMIS: [Điền]</w:t>
+              <w:t>Đạt phần kiến thức sản phẩm.</w:t>
             </w:r>
           </w:p>
         </w:tc>
@@ -843,7 +885,7 @@
                 <w:sz w:val="26"/>
                 <w:szCs w:val="26"/>
               </w:rPr>
-              <w:t xml:space="preserve">[Điền chỉ tiêu được giao]</w:t>
+              <w:t>Hỗ trợ lên đơn trên AMIS khi NVKD cần; xử lý hoá đơn trong ngày (gửi nháp → khách xác nhận → kế toán ký số → gửi đối tác); tổng hợp doanh số tuần; chăm sóc shop theo địa bàn.</w:t>
             </w:r>
           </w:p>
         </w:tc>
@@ -949,7 +991,7 @@
                 <w:sz w:val="26"/>
                 <w:szCs w:val="26"/>
               </w:rPr>
-              <w:t>[Điền yêu cầu được giao]</w:t>
+              <w:t>Tìm nhà sản xuất bọt biển tắm bé và liên hệ được đúng người phụ trách.</w:t>
             </w:r>
           </w:p>
         </w:tc>

</xml_diff>